<commit_message>
Fill in group 6 names; extend experiment Excel with app check and iteration history
Co-Authored-By: Claude Opus 5.5 <noreply@anthropic.com>
Claude-Session: https://claude.ai/code/session_01AWLf4Vf7U3nex8wdXcBp7P
</commit_message>
<xml_diff>
--- a/ISOM5240_GroupProject/presentation/Video_script.docx
+++ b/ISOM5240_GroupProject/presentation/Video_script.docx
@@ -41,7 +41,7 @@
         <w:rPr>
           <w:color w:val="555555"/>
         </w:rPr>
-        <w:t xml:space="preserve">分工：第 1–5 页由组员 1 讲，第 6–12 页由组员 2 讲。录视频时两人都要露脸。[姓名] 处请换成自己的名字。</w:t>
+        <w:t xml:space="preserve">分工：第 1–5 页由 Ou Zhiyong 讲，第 6–12 页由 Zhang Ludan 讲。录视频时两人都要露脸。</w:t>
       </w:r>
     </w:p>
     <w:p>
@@ -222,7 +222,7 @@
                 <w:sz w:val="16"/>
                 <w:szCs w:val="16"/>
               </w:rPr>
-              <w:t xml:space="preserve">Student 1</w:t>
+              <w:t xml:space="preserve">Ou Zhiyong</w:t>
             </w:r>
           </w:p>
           <w:p>
@@ -235,7 +235,7 @@
                 <w:sz w:val="16"/>
                 <w:szCs w:val="16"/>
               </w:rPr>
-              <w:t xml:space="preserve">≈ 27s</w:t>
+              <w:t xml:space="preserve">≈ 30s</w:t>
             </w:r>
           </w:p>
         </w:tc>
@@ -264,7 +264,7 @@
                 <w:sz w:val="20"/>
                 <w:szCs w:val="20"/>
               </w:rPr>
-              <w:t xml:space="preserve">Hello everyone. We are [names], and our project is called Review Intelligence for Hotel Revenue Management. We built it for Oriental Horizon Hotel Business, the hotel company one of us works for. In the next ten minutes we will show how two fine-tuned deep-learning models turn guest reviews into signals that help the hotel set its room prices.</w:t>
+              <w:t xml:space="preserve">Hello everyone. We are Ou Zhiyong and Zhang Ludan from Group 6, and our project is called Review Intelligence for Hotel Revenue Management. We built it for Oriental Horizon Hotel Business, the hotel company one of us works for. In the next ten minutes we will show how two fine-tuned deep-learning models turn guest reviews into signals that help the hotel set its room prices.</w:t>
             </w:r>
           </w:p>
         </w:tc>
@@ -294,7 +294,7 @@
                 <w:sz w:val="18"/>
                 <w:szCs w:val="18"/>
               </w:rPr>
-              <w:t xml:space="preserve">大家好。我们是 [姓名]，项目叫“酒店收益管理的评论智能”，是为我们其中一人工作的东方地平线酒店做的。接下来十分钟介绍两个微调过的深度学习模型，怎样把住客评论变成帮助酒店定房价的信号。</w:t>
+              <w:t xml:space="preserve">大家好。我们是第 6 组的 Ou Zhiyong 和 Zhang Ludan，项目叫“酒店收益管理的评论智能”，是为我们其中一人工作的东方地平线酒店做的。接下来十分钟介绍两个微调过的深度学习模型，怎样把住客评论变成帮助酒店定房价的信号。</w:t>
             </w:r>
           </w:p>
         </w:tc>
@@ -357,7 +357,7 @@
                 <w:sz w:val="16"/>
                 <w:szCs w:val="16"/>
               </w:rPr>
-              <w:t xml:space="preserve">Student 1</w:t>
+              <w:t xml:space="preserve">Ou Zhiyong</w:t>
             </w:r>
           </w:p>
           <w:p>
@@ -493,7 +493,7 @@
                 <w:sz w:val="16"/>
                 <w:szCs w:val="16"/>
               </w:rPr>
-              <w:t xml:space="preserve">Student 1</w:t>
+              <w:t xml:space="preserve">Ou Zhiyong</w:t>
             </w:r>
           </w:p>
           <w:p>
@@ -628,7 +628,7 @@
                 <w:sz w:val="16"/>
                 <w:szCs w:val="16"/>
               </w:rPr>
-              <w:t xml:space="preserve">Student 1</w:t>
+              <w:t xml:space="preserve">Ou Zhiyong</w:t>
             </w:r>
           </w:p>
           <w:p>
@@ -764,7 +764,7 @@
                 <w:sz w:val="16"/>
                 <w:szCs w:val="16"/>
               </w:rPr>
-              <w:t xml:space="preserve">Student 1</w:t>
+              <w:t xml:space="preserve">Ou Zhiyong</w:t>
             </w:r>
           </w:p>
           <w:p>
@@ -806,7 +806,7 @@
                 <w:sz w:val="20"/>
                 <w:szCs w:val="20"/>
               </w:rPr>
-              <w:t xml:space="preserve">Each of us fine-tuned one model. I fine-tuned the sentiment model, and my teammate fine-tuned the guest-segment model. For both tasks we compared two small pre-trained models from Hugging Face, DistilBERT and DistilRoBERTa. They are distilled versions of BERT, so they keep most of BERT's accuracy but are fast enough to run on Streamlit's CPU. We also tested two larger models without any fine-tuning as baselines. Training ran on a free Colab GPU: two epochs, learning rate 3e-5, batch size 32 and a maximum of 256 tokens per review. We kept the epoch with the best validation macro-F1. I will now hand over to my teammate for the results.</w:t>
+              <w:t xml:space="preserve">Each of us fine-tuned one model. I, Zhiyong, fine-tuned the sentiment model, and Ludan fine-tuned the guest-segment model. For both tasks we compared two small pre-trained models from Hugging Face, DistilBERT and DistilRoBERTa. They are distilled versions of BERT, so they keep most of BERT's accuracy but are fast enough to run on Streamlit's CPU. We also tested two larger models without any fine-tuning as baselines. Training ran on a free Colab GPU: two epochs, learning rate 3e-5, batch size 32 and a maximum of 256 tokens per review. We kept the epoch with the best validation macro-F1. I will now hand over to Ludan for the results.</w:t>
             </w:r>
           </w:p>
         </w:tc>
@@ -836,7 +836,7 @@
                 <w:sz w:val="18"/>
                 <w:szCs w:val="18"/>
               </w:rPr>
-              <w:t xml:space="preserve">我们每人负责微调一个模型：我做口碑模型，组员做客群模型。两个任务都比较了两个 Hugging Face 小模型 DistilBERT 和 DistilRoBERTa，它们是精简版 BERT，准确率接近但速度快，能在 Streamlit 的 CPU 上跑。还拿两个没训练过的大模型做对照。在 Colab 免费 GPU 上训练 2 轮，学习率 3e-5，批大小 32，每条最多 256 个词元，保留验证集表现最好的那一轮。下面交给组员讲结果。</w:t>
+              <w:t xml:space="preserve">我们每人负责微调一个模型：我（志勇）做口碑模型，Ludan 做客群模型。两个任务都比较了两个 Hugging Face 小模型 DistilBERT 和 DistilRoBERTa，它们是精简版 BERT，准确率接近但速度快，能在 Streamlit 的 CPU 上跑。还拿两个没训练过的大模型做对照。在 Colab 免费 GPU 上训练 2 轮，学习率 3e-5，批大小 32，每条最多 256 个词元，保留验证集表现最好的那一轮。下面交给 Ludan 讲结果。</w:t>
             </w:r>
           </w:p>
         </w:tc>
@@ -899,7 +899,7 @@
                 <w:sz w:val="16"/>
                 <w:szCs w:val="16"/>
               </w:rPr>
-              <w:t xml:space="preserve">Student 2</w:t>
+              <w:t xml:space="preserve">Zhang Ludan</w:t>
             </w:r>
           </w:p>
           <w:p>
@@ -973,7 +973,7 @@
                 <w:sz w:val="18"/>
                 <w:szCs w:val="18"/>
               </w:rPr>
-              <w:t xml:space="preserve">（换组员讲）我们不是一次成功的。第一轮每类 6000 条，客群分三类：商务/情侣/家庭。口碑 72.7%，客群只有 55.8%，三条家庭评论有一条被当成情侣，因为多数评论不提和谁出行。第二轮改成商务 vs 休闲，这也是酒店收益管理最重要的分法，数据增加 2.5 倍。口碑升到 75%，客群到 72%。</w:t>
+              <w:t xml:space="preserve">（换 Ludan 讲）我们不是一次成功的。第一轮每类 6000 条，客群分三类：商务/情侣/家庭。口碑 72.7%，客群只有 55.8%，三条家庭评论有一条被当成情侣，因为多数评论不提和谁出行。第二轮改成商务 vs 休闲，这也是酒店收益管理最重要的分法，数据增加 2.5 倍。口碑升到 75%，客群到 72%。</w:t>
             </w:r>
           </w:p>
         </w:tc>
@@ -1035,7 +1035,7 @@
                 <w:sz w:val="16"/>
                 <w:szCs w:val="16"/>
               </w:rPr>
-              <w:t xml:space="preserve">Student 2</w:t>
+              <w:t xml:space="preserve">Zhang Ludan</w:t>
             </w:r>
           </w:p>
           <w:p>
@@ -1170,7 +1170,7 @@
                 <w:sz w:val="16"/>
                 <w:szCs w:val="16"/>
               </w:rPr>
-              <w:t xml:space="preserve">Student 2</w:t>
+              <w:t xml:space="preserve">Zhang Ludan</w:t>
             </w:r>
           </w:p>
           <w:p>
@@ -1306,7 +1306,7 @@
                 <w:sz w:val="16"/>
                 <w:szCs w:val="16"/>
               </w:rPr>
-              <w:t xml:space="preserve">Student 2</w:t>
+              <w:t xml:space="preserve">Zhang Ludan</w:t>
             </w:r>
           </w:p>
           <w:p>
@@ -1441,7 +1441,7 @@
                 <w:sz w:val="16"/>
                 <w:szCs w:val="16"/>
               </w:rPr>
-              <w:t xml:space="preserve">Student 2</w:t>
+              <w:t xml:space="preserve">Zhang Ludan</w:t>
             </w:r>
           </w:p>
           <w:p>
@@ -1577,7 +1577,7 @@
                 <w:sz w:val="16"/>
                 <w:szCs w:val="16"/>
               </w:rPr>
-              <w:t xml:space="preserve">Student 2</w:t>
+              <w:t xml:space="preserve">Zhang Ludan</w:t>
             </w:r>
           </w:p>
           <w:p>
@@ -1712,7 +1712,7 @@
                 <w:sz w:val="16"/>
                 <w:szCs w:val="16"/>
               </w:rPr>
-              <w:t xml:space="preserve">Student 2</w:t>
+              <w:t xml:space="preserve">Zhang Ludan</w:t>
             </w:r>
           </w:p>
           <w:p>

</xml_diff>